<commit_message>
Update NSPA workshop from supplied 31-slide deck and illustrated guide
</commit_message>
<xml_diff>
--- a/2026/handouts/session-takeaways.docx
+++ b/2026/handouts/session-takeaways.docx
@@ -113,7 +113,7 @@
           <w:bCs/>
           <w:color w:val="2e4f66"/>
         </w:rPr>
-        <w:t xml:space="preserve">Keep people accountable for decisions</w:t>
+        <w:t xml:space="preserve">Keep people responsible for decisions</w:t>
       </w:r>
     </w:p>
     <w:p>
@@ -134,7 +134,7 @@
           <w:rFonts w:ascii="Poppins" w:hAnsi="Poppins" w:cs="Poppins"/>
           <w:color w:val="2e4f66"/>
         </w:rPr>
-        <w:t xml:space="preserve">AI can sort, summarize, and suggest. People decide. Use clerical drafts only with approved inputs and accuracy checks.</w:t>
+        <w:t xml:space="preserve">Use assistance for file naming and completeness checks. Check rubric evidence and consequential summaries carefully. Keep awards, exceptions, and appeals with people.</w:t>
       </w:r>
     </w:p>
     <w:p>
@@ -155,7 +155,7 @@
           <w:rFonts w:ascii="Poppins" w:hAnsi="Poppins" w:cs="Poppins"/>
           <w:color w:val="2e4f66"/>
         </w:rPr>
-        <w:t xml:space="preserve">Rubric pre-scores, tags, and consequential summaries need source verification. Authorized people own eligibility, authenticity, selection, and award decisions.</w:t>
+        <w:t xml:space="preserve">Follow the six-step path: receive, minimize, organize, map evidence, verify, and make a human decision.</w:t>
       </w:r>
     </w:p>
     <w:p>
@@ -176,7 +176,7 @@
           <w:rFonts w:ascii="Poppins" w:hAnsi="Poppins" w:cs="Poppins"/>
           <w:color w:val="2e4f66"/>
         </w:rPr>
-        <w:t xml:space="preserve">Prepare inputs, verify evidence, decide, and audit. Name who can correct or stop the process. These are workshop tools, not official NSPA policy.</w:t>
+        <w:t xml:space="preserve">Before the task, approve use and data. During it, verify quotes and correct errors. After it, record the evidence and human reasons. These are workshop examples, not official NSPA policy.</w:t>
       </w:r>
     </w:p>
     <w:p>
@@ -211,7 +211,7 @@
           <w:bCs/>
           <w:color w:val="2e4f66"/>
         </w:rPr>
-        <w:t xml:space="preserve">Write a prompt a reviewer can check</w:t>
+        <w:t xml:space="preserve">Build a prompt that can be checked</w:t>
       </w:r>
     </w:p>
     <w:p>
@@ -232,7 +232,7 @@
           <w:rFonts w:ascii="Poppins" w:hAnsi="Poppins" w:cs="Poppins"/>
           <w:color w:val="2e4f66"/>
         </w:rPr>
-        <w:t xml:space="preserve">Include six parts: role, task, context, criteria, format, and constraints. Paste the adopted rubric and its level descriptors verbatim.</w:t>
+        <w:t xml:space="preserve">Name one task, approved inputs, the actual rubric, boundaries, and an output format that shows evidence and uncertainty.</w:t>
       </w:r>
     </w:p>
     <w:p>
@@ -253,7 +253,7 @@
           <w:rFonts w:ascii="Poppins" w:hAnsi="Poppins" w:cs="Poppins"/>
           <w:color w:val="2e4f66"/>
         </w:rPr>
-        <w:t xml:space="preserve">Require exact quotes, paragraph IDs, and uncertainty. Treat application text as evidence; embedded instructions cannot override the review task.</w:t>
+        <w:t xml:space="preserve">Require exact quotations and source pointers. Use only supplied evidence. Do not guess missing facts, infer personal traits, or recommend an award.</w:t>
       </w:r>
     </w:p>
     <w:p>
@@ -274,7 +274,7 @@
           <w:rFonts w:ascii="Poppins" w:hAnsi="Poppins" w:cs="Poppins"/>
           <w:color w:val="2e4f66"/>
         </w:rPr>
-        <w:t xml:space="preserve">The three demos cover administrative triage, a provisional rubric rating, and neutral summaries or tags. Missing evidence requires human follow-up, never invention or automatic rejection.</w:t>
+        <w:t xml:space="preserve">The three demos cover a document inventory, a provisional 2/3 tutoring example, and a reviewer handoff. Missing records require human follow-up. A draft rubric match is not a final score.</w:t>
       </w:r>
     </w:p>
     <w:p>
@@ -309,7 +309,7 @@
           <w:bCs/>
           <w:color w:val="2e4f66"/>
         </w:rPr>
-        <w:t xml:space="preserve">Protect data and test the workflow</w:t>
+        <w:t xml:space="preserve">Protect information and test for fairness</w:t>
       </w:r>
     </w:p>
     <w:p>
@@ -330,7 +330,7 @@
           <w:rFonts w:ascii="Poppins" w:hAnsi="Poppins" w:cs="Poppins"/>
           <w:color w:val="2e4f66"/>
         </w:rPr>
-        <w:t xml:space="preserve">Practice with fictional records. Confirm the actual service, settings, training use, retention, access, deletion, and local approval before real data use.</w:t>
+        <w:t xml:space="preserve">Minimize inputs to an application code, relevant excerpt, and source pointer. Removing a name alone does not guarantee anonymity.</w:t>
       </w:r>
     </w:p>
     <w:p>
@@ -351,7 +351,7 @@
           <w:rFonts w:ascii="Poppins" w:hAnsi="Poppins" w:cs="Poppins"/>
           <w:color w:val="2e4f66"/>
         </w:rPr>
-        <w:t xml:space="preserve">Remove unneeded details. Deleting a name alone may leave identifying information. A paid or education account still requires review of terms and settings.</w:t>
+        <w:t xml:space="preserve">Before upload, confirm tool and task approval, staff access, storage and reuse, and the incident response plan. Even minimized information needs an approved system.</w:t>
       </w:r>
     </w:p>
     <w:p>
@@ -372,23 +372,8 @@
           <w:rFonts w:ascii="Poppins" w:hAnsi="Poppins" w:cs="Poppins"/>
           <w:color w:val="2e4f66"/>
         </w:rPr>
-        <w:t xml:space="preserve">Repeat fictional cases, change only a name in a controlled test, and compare with independent human judgments. Ten cases may reveal a problem; they cannot certify fairness.</w:t>
-      </w:r>
-    </w:p>
-    <w:p>
-      <w:pPr>
-        <w:rPr>
-          <w:rFonts w:ascii="Poppins" w:hAnsi="Poppins" w:cs="Poppins"/>
-          <w:color w:val="2e4f66"/>
-        </w:rPr>
-        <w:spacing w:line="120" w:lineRule="exact" w:after="0" w:before="0"/>
-      </w:pPr>
-    </w:p>
-    <w:p>
-      <w:pPr>
-        <w:jc w:val="both"/>
-        <w:pageBreakBefore/>
-      </w:pPr>
+        <w:t xml:space="preserve">Test varied fictional cases. Compare omissions and uneven treatment. Have reviewers discuss differences, correct the workflow, and retest before real use.</w:t>
+      </w:r>
     </w:p>
     <w:p>
       <w:pPr>
@@ -402,6 +387,7 @@
           <w:sz w:val="32"/>
           <w:szCs w:val="32"/>
         </w:rPr>
+        <w:pageBreakBefore/>
       </w:pPr>
       <w:r>
         <w:rPr>
@@ -496,7 +482,7 @@
           <w:bCs/>
           <w:color w:val="2e4f66"/>
         </w:rPr>
-        <w:t xml:space="preserve">Treat applicant AI use fairly</w:t>
+        <w:t xml:space="preserve">Respond fairly to applicant AI use</w:t>
       </w:r>
     </w:p>
     <w:p>
@@ -517,7 +503,7 @@
           <w:rFonts w:ascii="Poppins" w:hAnsi="Poppins" w:cs="Poppins"/>
           <w:color w:val="2e4f66"/>
         </w:rPr>
-        <w:t xml:space="preserve">Distinguish mechanical help, brainstorming, draft development, and substitution. Explain permitted uses, accessibility and translation support, and any required disclosure.</w:t>
+        <w:t xml:space="preserve">Publish which assistance is allowed. Brainstorming, outlining, and proofreading differ from invented achievements, hardship, experiences, or references.</w:t>
       </w:r>
     </w:p>
     <w:p>
@@ -538,7 +524,7 @@
           <w:rFonts w:ascii="Poppins" w:hAnsi="Poppins" w:cs="Poppins"/>
           <w:color w:val="2e4f66"/>
         </w:rPr>
-        <w:t xml:space="preserve">Polished writing and detector results alone cannot establish misconduct. Historical research findings are specific to the samples and tools studied.</w:t>
+        <w:t xml:space="preserve">Assess actual contributions, supporting evidence, and reflection. Polished grammar and detector scores do not prove authorship or misconduct.</w:t>
       </w:r>
     </w:p>
     <w:p>
@@ -559,7 +545,7 @@
           <w:rFonts w:ascii="Poppins" w:hAnsi="Poppins" w:cs="Poppins"/>
           <w:color w:val="2e4f66"/>
         </w:rPr>
-        <w:t xml:space="preserve">Use the published rule and actual evidence. Apply follow-up consistently, offer an accessible response route, and keep correction and appeal decisions with people.</w:t>
+        <w:t xml:space="preserve">Pause automatic penalties. Check records and published rules. Invite clarification when appropriate. Document the human decision and how it can be reconsidered.</w:t>
       </w:r>
     </w:p>
     <w:p>
@@ -594,7 +580,7 @@
           <w:bCs/>
           <w:color w:val="2e4f66"/>
         </w:rPr>
-        <w:t xml:space="preserve">Make transparency work both ways</w:t>
+        <w:t xml:space="preserve">Write clear rules for both sides</w:t>
       </w:r>
     </w:p>
     <w:p>
@@ -615,7 +601,7 @@
           <w:rFonts w:ascii="Poppins" w:hAnsi="Poppins" w:cs="Poppins"/>
           <w:color w:val="2e4f66"/>
         </w:rPr>
-        <w:t xml:space="preserve">Choose a policy approach: prohibit, disclose, bounded use, embrace, or an explained combination. Give examples and publish the rule before applications open.</w:t>
+        <w:t xml:space="preserve">Applicant guidance should explain allowed AI help, truthful work, disclosure, and the review process before applications open.</w:t>
       </w:r>
     </w:p>
     <w:p>
@@ -636,7 +622,7 @@
           <w:rFonts w:ascii="Poppins" w:hAnsi="Poppins" w:cs="Poppins"/>
           <w:color w:val="2e4f66"/>
         </w:rPr>
-        <w:t xml:space="preserve">Explain where provider AI supports review, who verifies its work, who decides, and how applicants can request correction.</w:t>
+        <w:t xml:space="preserve">Staff rules should name approved tools and tasks, the published rubric, source verification, and required documentation.</w:t>
       </w:r>
     </w:p>
     <w:p>
@@ -657,7 +643,7 @@
           <w:rFonts w:ascii="Poppins" w:hAnsi="Poppins" w:cs="Poppins"/>
           <w:color w:val="2e4f66"/>
         </w:rPr>
-        <w:t xml:space="preserve">Publish only promises supported by the actual service and process. Keep disclosure brief; do not require private chat histories or unnecessary personal information.</w:t>
+        <w:t xml:space="preserve">Illustrative wording: You may use AI to brainstorm or proofread. Claims must be truthful. Follow disclosure instructions. A detector score alone will not decide eligibility. Adapt the actual rule locally.</w:t>
       </w:r>
     </w:p>
     <w:p>
@@ -692,7 +678,7 @@
           <w:bCs/>
           <w:color w:val="2e4f66"/>
         </w:rPr>
-        <w:t xml:space="preserve">Plan the next 30 / 60 / 90 days</w:t>
+        <w:t xml:space="preserve">Prepare for the next review cycle</w:t>
       </w:r>
     </w:p>
     <w:p>
@@ -713,7 +699,7 @@
           <w:rFonts w:ascii="Poppins" w:hAnsi="Poppins" w:cs="Poppins"/>
           <w:color w:val="2e4f66"/>
         </w:rPr>
-        <w:t xml:space="preserve">30 days: choose one clerical pilot and an owner. Draft applicant guidance and a provider-use statement.</w:t>
+        <w:t xml:space="preserve">Clarify applicant and staff rules. Pilot one limited task with fictional cases. Check errors before considering actual applicant information.</w:t>
       </w:r>
     </w:p>
     <w:p>
@@ -734,7 +720,7 @@
           <w:rFonts w:ascii="Poppins" w:hAnsi="Poppins" w:cs="Poppins"/>
           <w:color w:val="2e4f66"/>
         </w:rPr>
-        <w:t xml:space="preserve">60 days: test fictional records, compare with human review, and record errors and corrections. 90 days: train reviewers, publish policy, and schedule an audit.</w:t>
+        <w:t xml:space="preserve">Name who verifies the work and who makes final decisions. Keep reasons and a reconsideration path. Review the pilot before continuing.</w:t>
       </w:r>
     </w:p>
     <w:p>
@@ -755,17 +741,8 @@
           <w:rFonts w:ascii="Poppins" w:hAnsi="Poppins" w:cs="Poppins"/>
           <w:color w:val="2e4f66"/>
         </w:rPr>
-        <w:t xml:space="preserve">Choose three checklist gaps, a review date, evidence of progress, and a pause condition.</w:t>
-      </w:r>
-    </w:p>
-    <w:p>
-      <w:pPr>
-        <w:rPr>
-          <w:rFonts w:ascii="Poppins" w:hAnsi="Poppins" w:cs="Poppins"/>
-          <w:color w:val="2e4f66"/>
-        </w:rPr>
-        <w:spacing w:line="120" w:lineRule="exact" w:after="0" w:before="0"/>
-      </w:pPr>
+        <w:t xml:space="preserve">Choose one workflow, one human safeguard, and one policy statement. Add an owner, a review date, evidence of improvement, and a pause condition.</w:t>
+      </w:r>
     </w:p>
     <w:p>
       <w:pPr>

</xml_diff>

<commit_message>
Update NSPA workshop for revised presentation and adaptive speaking guide
</commit_message>
<xml_diff>
--- a/2026/handouts/session-takeaways.docx
+++ b/2026/handouts/session-takeaways.docx
@@ -113,7 +113,7 @@
           <w:bCs/>
           <w:color w:val="2e4f66"/>
         </w:rPr>
-        <w:t xml:space="preserve">Keep people responsible for decisions</w:t>
+        <w:t xml:space="preserve">Assign authority and human checks</w:t>
       </w:r>
     </w:p>
     <w:p>
@@ -134,7 +134,7 @@
           <w:rFonts w:ascii="Poppins" w:hAnsi="Poppins" w:cs="Poppins"/>
           <w:color w:val="2e4f66"/>
         </w:rPr>
-        <w:t xml:space="preserve">Use assistance for file naming and completeness checks. Check rubric evidence and consequential summaries carefully. Keep awards, exceptions, and appeals with people.</w:t>
+        <w:t xml:space="preserve">Sort tasks into ASSIST, CHECK, or HUMAN. Organizing files can be assisted. Verify quotations and rubric matches. People decide awards, exceptions, and appeals.</w:t>
       </w:r>
     </w:p>
     <w:p>
@@ -155,7 +155,7 @@
           <w:rFonts w:ascii="Poppins" w:hAnsi="Poppins" w:cs="Poppins"/>
           <w:color w:val="2e4f66"/>
         </w:rPr>
-        <w:t xml:space="preserve">Follow the six-step path: receive, minimize, organize, map evidence, verify, and make a human decision.</w:t>
+        <w:t xml:space="preserve">For each task, name a safeguard and the person who can correct or stop the work. Follow receive, minimize, prepare, verify, and decide.</w:t>
       </w:r>
     </w:p>
     <w:p>
@@ -176,7 +176,7 @@
           <w:rFonts w:ascii="Poppins" w:hAnsi="Poppins" w:cs="Poppins"/>
           <w:color w:val="2e4f66"/>
         </w:rPr>
-        <w:t xml:space="preserve">Before the task, approve use and data. During it, verify quotes and correct errors. After it, record the evidence and human reasons. These are workshop examples, not official NSPA policy.</w:t>
+        <w:t xml:space="preserve">Before upload, satisfy both gates: approved use and only the information the task needs. Check tool, access, retention, reuse, and response plans.</w:t>
       </w:r>
     </w:p>
     <w:p>
@@ -211,7 +211,7 @@
           <w:bCs/>
           <w:color w:val="2e4f66"/>
         </w:rPr>
-        <w:t xml:space="preserve">Build a prompt that can be checked</w:t>
+        <w:t xml:space="preserve">Write requests and audit the evidence</w:t>
       </w:r>
     </w:p>
     <w:p>
@@ -232,7 +232,7 @@
           <w:rFonts w:ascii="Poppins" w:hAnsi="Poppins" w:cs="Poppins"/>
           <w:color w:val="2e4f66"/>
         </w:rPr>
-        <w:t xml:space="preserve">Name one task, approved inputs, the actual rubric, boundaries, and an output format that shows evidence and uncertainty.</w:t>
+        <w:t xml:space="preserve">Name the task, source, evidence requirement, and limit. Use one excerpt and the actual published criterion and anchors. Ask for quotations, source locations, gaps, and a neutral question.</w:t>
       </w:r>
     </w:p>
     <w:p>
@@ -253,7 +253,7 @@
           <w:rFonts w:ascii="Poppins" w:hAnsi="Poppins" w:cs="Poppins"/>
           <w:color w:val="2e4f66"/>
         </w:rPr>
-        <w:t xml:space="preserve">Require exact quotations and source pointers. Use only supplied evidence. Do not guess missing facts, infer personal traits, or recommend an award.</w:t>
+        <w:t xml:space="preserve">In fictional A17, paragraph 2 supports 12 tutoring sessions and two recruited volunteers. It does not establish 120 students served, improved grades, or an unsupported leadership trait.</w:t>
       </w:r>
     </w:p>
     <w:p>
@@ -274,7 +274,7 @@
           <w:rFonts w:ascii="Poppins" w:hAnsi="Poppins" w:cs="Poppins"/>
           <w:color w:val="2e4f66"/>
         </w:rPr>
-        <w:t xml:space="preserve">The three demos cover a document inventory, a provisional 2/3 tutoring example, and a reviewer handoff. Missing records require human follow-up. A draft rubric match is not a final score.</w:t>
+        <w:t xml:space="preserve">The teaching rubric supports a provisional 2/3 for a specific contribution without result evidence. Keep the quotation, source pointer, and open question in the handoff.</w:t>
       </w:r>
     </w:p>
     <w:p>
@@ -309,7 +309,7 @@
           <w:bCs/>
           <w:color w:val="2e4f66"/>
         </w:rPr>
-        <w:t xml:space="preserve">Protect information and test for fairness</w:t>
+        <w:t xml:space="preserve">Calibrate with the same anchors</w:t>
       </w:r>
     </w:p>
     <w:p>
@@ -330,7 +330,7 @@
           <w:rFonts w:ascii="Poppins" w:hAnsi="Poppins" w:cs="Poppins"/>
           <w:color w:val="2e4f66"/>
         </w:rPr>
-        <w:t xml:space="preserve">Minimize inputs to an application code, relevant excerpt, and source pointer. Removing a name alone does not guarantee anonymity.</w:t>
+        <w:t xml:space="preserve">Score equivalent evidence with the same rubric. Both tutoring excerpts describe the same contribution and support 2/3 under the fictional teaching anchor.</w:t>
       </w:r>
     </w:p>
     <w:p>
@@ -351,7 +351,7 @@
           <w:rFonts w:ascii="Poppins" w:hAnsi="Poppins" w:cs="Poppins"/>
           <w:color w:val="2e4f66"/>
         </w:rPr>
-        <w:t xml:space="preserve">Before upload, confirm tool and task approval, staff access, storage and reuse, and the incident response plan. Even minimized information needs an approved system.</w:t>
+        <w:t xml:space="preserve">Do not substitute vocabulary, polish, or prestige for evidence. A score of 3 in this example needs a specific contribution and a supported result.</w:t>
       </w:r>
     </w:p>
     <w:p>
@@ -372,7 +372,7 @@
           <w:rFonts w:ascii="Poppins" w:hAnsi="Poppins" w:cs="Poppins"/>
           <w:color w:val="2e4f66"/>
         </w:rPr>
-        <w:t xml:space="preserve">Test varied fictional cases. Compare omissions and uneven treatment. Have reviewers discuss differences, correct the workflow, and retest before real use.</w:t>
+        <w:t xml:space="preserve">One comparison does not prove fairness. Test varied fictional cases, compare unsupported claims and omissions, discuss judgments, correct, and retest.</w:t>
       </w:r>
     </w:p>
     <w:p>
@@ -482,7 +482,7 @@
           <w:bCs/>
           <w:color w:val="2e4f66"/>
         </w:rPr>
-        <w:t xml:space="preserve">Respond fairly to applicant AI use</w:t>
+        <w:t xml:space="preserve">Publish applicant boundaries and fair responses</w:t>
       </w:r>
     </w:p>
     <w:p>
@@ -503,7 +503,7 @@
           <w:rFonts w:ascii="Poppins" w:hAnsi="Poppins" w:cs="Poppins"/>
           <w:color w:val="2e4f66"/>
         </w:rPr>
-        <w:t xml:space="preserve">Publish which assistance is allowed. Brainstorming, outlining, and proofreading differ from invented achievements, hardship, experiences, or references.</w:t>
+        <w:t xml:space="preserve">Decide rules for proofreading, translation, and drafting from truthful notes. Invented achievements conflict with truthful claims. Specify disclosure before applications open.</w:t>
       </w:r>
     </w:p>
     <w:p>
@@ -524,7 +524,7 @@
           <w:rFonts w:ascii="Poppins" w:hAnsi="Poppins" w:cs="Poppins"/>
           <w:color w:val="2e4f66"/>
         </w:rPr>
-        <w:t xml:space="preserve">Assess actual contributions, supporting evidence, and reflection. Polished grammar and detector scores do not prove authorship or misconduct.</w:t>
+        <w:t xml:space="preserve">A detector can flag human writing or miss AI-generated text. A score alone cannot establish authorship, a policy violation, or eligibility.</w:t>
       </w:r>
     </w:p>
     <w:p>
@@ -545,7 +545,7 @@
           <w:rFonts w:ascii="Poppins" w:hAnsi="Poppins" w:cs="Poppins"/>
           <w:color w:val="2e4f66"/>
         </w:rPr>
-        <w:t xml:space="preserve">Pause automatic penalties. Check records and published rules. Invite clarification when appropriate. Document the human decision and how it can be reconsidered.</w:t>
+        <w:t xml:space="preserve">Pause automatic penalties, check evidence and the published rule, invite clarification when appropriate, and record human reasons and the reconsideration route.</w:t>
       </w:r>
     </w:p>
     <w:p>
@@ -580,7 +580,7 @@
           <w:bCs/>
           <w:color w:val="2e4f66"/>
         </w:rPr>
-        <w:t xml:space="preserve">Write clear rules for both sides</w:t>
+        <w:t xml:space="preserve">Draft three usable policy sentences</w:t>
       </w:r>
     </w:p>
     <w:p>
@@ -601,7 +601,7 @@
           <w:rFonts w:ascii="Poppins" w:hAnsi="Poppins" w:cs="Poppins"/>
           <w:color w:val="2e4f66"/>
         </w:rPr>
-        <w:t xml:space="preserve">Applicant guidance should explain allowed AI help, truthful work, disclosure, and the review process before applications open.</w:t>
+        <w:t xml:space="preserve">Applicants: Name allowed help, responsibility for the statement and claims, and when and how to disclose. Make unresolved choices explicit.</w:t>
       </w:r>
     </w:p>
     <w:p>
@@ -622,7 +622,7 @@
           <w:rFonts w:ascii="Poppins" w:hAnsi="Poppins" w:cs="Poppins"/>
           <w:color w:val="2e4f66"/>
         </w:rPr>
-        <w:t xml:space="preserve">Staff rules should name approved tools and tasks, the published rubric, source verification, and required documentation.</w:t>
+        <w:t xml:space="preserve">Reviewers: Name the approved task and service, the person who verifies quotations and sources, and when that check occurs.</w:t>
       </w:r>
     </w:p>
     <w:p>
@@ -643,7 +643,7 @@
           <w:rFonts w:ascii="Poppins" w:hAnsi="Poppins" w:cs="Poppins"/>
           <w:color w:val="2e4f66"/>
         </w:rPr>
-        <w:t xml:space="preserve">Illustrative wording: You may use AI to brainstorm or proofread. Claims must be truthful. Follow disclosure instructions. A detector score alone will not decide eligibility. Adapt the actual rule locally.</w:t>
+        <w:t xml:space="preserve">Concerns: Explain evidence review, clarification, and reconsideration. Specify a contact, review steps, and response timeline. Adapt workshop samples locally.</w:t>
       </w:r>
     </w:p>
     <w:p>
@@ -678,7 +678,7 @@
           <w:bCs/>
           <w:color w:val="2e4f66"/>
         </w:rPr>
-        <w:t xml:space="preserve">Prepare for the next review cycle</w:t>
+        <w:t xml:space="preserve">Plan and review a four-week pilot</w:t>
       </w:r>
     </w:p>
     <w:p>
@@ -699,7 +699,7 @@
           <w:rFonts w:ascii="Poppins" w:hAnsi="Poppins" w:cs="Poppins"/>
           <w:color w:val="2e4f66"/>
         </w:rPr>
-        <w:t xml:space="preserve">Clarify applicant and staff rules. Pilot one limited task with fictional cases. Check errors before considering actual applicant information.</w:t>
+        <w:t xml:space="preserve">Week 1: scope one task and owner. Week 2: test fictional cases and log errors. Week 3: compare, correct, and retest. Week 4: decide to proceed, revise, or stop.</w:t>
       </w:r>
     </w:p>
     <w:p>
@@ -720,7 +720,7 @@
           <w:rFonts w:ascii="Poppins" w:hAnsi="Poppins" w:cs="Poppins"/>
           <w:color w:val="2e4f66"/>
         </w:rPr>
-        <w:t xml:space="preserve">Name who verifies the work and who makes final decisions. Keep reasons and a reconsideration path. Review the pilot before continuing.</w:t>
+        <w:t xml:space="preserve">Set success criteria before testing. Confirm authorization for the service and data, verification ownership, retention, and policy readiness before any real use.</w:t>
       </w:r>
     </w:p>
     <w:p>
@@ -741,7 +741,7 @@
           <w:rFonts w:ascii="Poppins" w:hAnsi="Poppins" w:cs="Poppins"/>
           <w:color w:val="2e4f66"/>
         </w:rPr>
-        <w:t xml:space="preserve">Choose one workflow, one human safeguard, and one policy statement. Add an owner, a review date, evidence of improvement, and a pause condition.</w:t>
+        <w:t xml:space="preserve">Write one task, one specific human check, an owner, and a date. Name the evidence needed to continue and an error that would pause the pilot.</w:t>
       </w:r>
     </w:p>
     <w:p>

</xml_diff>